<commit_message>
Fix script bugs, extract shared module, add review mode to VS Code agent
Script fixes:
- Fix to_docx.py output filename: now produces _ProductDesigner_Resume.docx
- Fix O(n²) formatting bug in _add_formatted_run (apply per-run, not all)
- Replace lxml dependency with portable OxmlElement in to_docx.py
- Fix standalone Tools section being silently dropped in two-column scripts
- Fix contact line parsing: skip blank lines between name and contact

Refactor:
- Extract docx_shared.py with all common helpers (parse_markdown,
  parse_contact_items, fmt, heading, sidebar_lines, main_lines, etc.)
- Rewrite to_docx_two_column.py and to_docx_right_sidebar.py to import
  from shared module, eliminating ~80% code duplication

Agent:
- Add Path C (review mode) to VS Code Copilot agent routing
- Add .gitignore for Word temp files
</commit_message>
<xml_diff>
--- a/Jennifer_Lauren_ProductDesigner_Resume.docx
+++ b/Jennifer_Lauren_ProductDesigner_Resume.docx
@@ -345,6 +345,85 @@
           <w:color w:val="1A1A1A"/>
           <w:sz w:val="20"/>
         </w:rPr>
+        <w:t>RECOGNITION</w:t>
+      </w:r>
+    </w:p>
+    <w:p>
+      <w:pPr>
+        <w:pStyle w:val="ListBullet"/>
+        <w:spacing w:after="20" w:before="20"/>
+        <w:ind w:left="360"/>
+      </w:pPr>
+      <w:r>
+        <w:rPr>
+          <w:b/>
+          <w:sz w:val="19"/>
+        </w:rPr>
+        <w:t>Red Dot Design Award</w:t>
+      </w:r>
+      <w:r>
+        <w:rPr>
+          <w:b w:val="0"/>
+          <w:sz w:val="19"/>
+        </w:rPr>
+        <w:t xml:space="preserve"> — AI Recommendations Engine, Microsoft 365, 2025</w:t>
+      </w:r>
+    </w:p>
+    <w:p>
+      <w:pPr>
+        <w:pStyle w:val="ListBullet"/>
+        <w:spacing w:after="20" w:before="20"/>
+        <w:ind w:left="360"/>
+      </w:pPr>
+      <w:r>
+        <w:rPr>
+          <w:b/>
+          <w:sz w:val="19"/>
+        </w:rPr>
+        <w:t>IXDA Interaction Award Finalist</w:t>
+      </w:r>
+      <w:r>
+        <w:rPr>
+          <w:b w:val="0"/>
+          <w:sz w:val="19"/>
+        </w:rPr>
+        <w:t xml:space="preserve"> — Patient Portal Redesign, Healthvana, 2022</w:t>
+      </w:r>
+    </w:p>
+    <w:p>
+      <w:pPr>
+        <w:pStyle w:val="ListBullet"/>
+        <w:spacing w:after="20" w:before="20"/>
+        <w:ind w:left="360"/>
+      </w:pPr>
+      <w:r>
+        <w:rPr>
+          <w:b/>
+          <w:sz w:val="19"/>
+        </w:rPr>
+        <w:t>Webby Award Honoree</w:t>
+      </w:r>
+      <w:r>
+        <w:rPr>
+          <w:b w:val="0"/>
+          <w:sz w:val="19"/>
+        </w:rPr>
+        <w:t xml:space="preserve"> — Merchant Analytics Dashboard, Stripe, 2023</w:t>
+      </w:r>
+    </w:p>
+    <w:p>
+      <w:pPr>
+        <w:spacing w:before="200" w:after="60"/>
+        <w:pBdr>
+          <w:bottom w:val="single" w:sz="4" w:space="1" w:color="AAAAAA"/>
+        </w:pBdr>
+      </w:pPr>
+      <w:r>
+        <w:rPr>
+          <w:b/>
+          <w:color w:val="1A1A1A"/>
+          <w:sz w:val="20"/>
+        </w:rPr>
         <w:t>EDUCATION</w:t>
       </w:r>
     </w:p>

</xml_diff>